<commit_message>
Auto Daily 8:00 PM Dashboard Update [2026-08-11 20:00]
</commit_message>
<xml_diff>
--- a/docs/weekly/2026-W33_當週執行率回顧報告.docx
+++ b/docs/weekly/2026-W33_當週執行率回顧報告.docx
@@ -21,7 +21,7 @@
           <w:color w:val="555555"/>
           <w:sz w:val="20"/>
         </w:rPr>
-        <w:t>週期：2026/08/10–2026/08/16　｜　整體時間執行率：0.0%</w:t>
+        <w:t>週期：2026/08/10–2026/08/16　｜　整體時間執行率：9.0%</w:t>
       </w:r>
     </w:p>
     <w:p>
@@ -538,7 +538,7 @@
                 <w:color w:val="000000"/>
                 <w:sz w:val="19"/>
               </w:rPr>
-              <w:t>7.00 hr</w:t>
+              <w:t>6.00 hr</w:t>
             </w:r>
           </w:p>
         </w:tc>
@@ -700,7 +700,7 @@
                 <w:color w:val="000000"/>
                 <w:sz w:val="19"/>
               </w:rPr>
-              <w:t>3</w:t>
+              <w:t>2</w:t>
             </w:r>
           </w:p>
         </w:tc>
@@ -783,7 +783,7 @@
                 <w:color w:val="000000"/>
                 <w:sz w:val="19"/>
               </w:rPr>
-              <w:t>0.00 hr</w:t>
+              <w:t>1.43 hr</w:t>
             </w:r>
           </w:p>
         </w:tc>
@@ -810,7 +810,7 @@
                 <w:color w:val="000000"/>
                 <w:sz w:val="19"/>
               </w:rPr>
-              <w:t>0.0%</w:t>
+              <w:t>24.6%</w:t>
             </w:r>
           </w:p>
         </w:tc>
@@ -864,7 +864,7 @@
                 <w:color w:val="000000"/>
                 <w:sz w:val="19"/>
               </w:rPr>
-              <w:t>0.00 km</w:t>
+              <w:t>11.92 km</w:t>
             </w:r>
           </w:p>
         </w:tc>
@@ -891,7 +891,7 @@
                 <w:color w:val="000000"/>
                 <w:sz w:val="19"/>
               </w:rPr>
-              <w:t>0.0%</w:t>
+              <w:t>23.1%</w:t>
             </w:r>
           </w:p>
         </w:tc>
@@ -1550,7 +1550,7 @@
                 <w:color w:val="000000"/>
                 <w:sz w:val="19"/>
               </w:rPr>
-              <w:t>Run</w:t>
+              <w:t>Run: Running</w:t>
             </w:r>
           </w:p>
         </w:tc>
@@ -1631,7 +1631,7 @@
                 <w:color w:val="000000"/>
                 <w:sz w:val="19"/>
               </w:rPr>
-              <w:t>0分</w:t>
+              <w:t>86分 / 11.92km</w:t>
             </w:r>
           </w:p>
         </w:tc>
@@ -1658,173 +1658,7 @@
                 <w:color w:val="000000"/>
                 <w:sz w:val="19"/>
               </w:rPr>
-              <w:t>❌ 未執行</w:t>
-            </w:r>
-          </w:p>
-        </w:tc>
-      </w:tr>
-      <w:tr>
-        <w:tc>
-          <w:tcPr>
-            <w:tcW w:type="dxa" w:w="1100"/>
-            <w:tcMar>
-              <w:top w:w="80" w:type="dxa"/>
-              <w:start w:w="120" w:type="dxa"/>
-              <w:bottom w:w="80" w:type="dxa"/>
-              <w:end w:w="120" w:type="dxa"/>
-            </w:tcMar>
-            <w:vAlign w:val="center"/>
-          </w:tcPr>
-          <w:p>
-            <w:pPr>
-              <w:spacing w:after="0"/>
-              <w:jc w:val="center"/>
-            </w:pPr>
-            <w:r>
-              <w:rPr>
-                <w:rFonts w:ascii="Calibri" w:hAnsi="Calibri" w:eastAsia="Microsoft JhengHei"/>
-                <w:b w:val="0"/>
-                <w:color w:val="000000"/>
-                <w:sz w:val="19"/>
-              </w:rPr>
-              <w:t>08/11</w:t>
-              <w:br/>
-              <w:t>週二</w:t>
-            </w:r>
-          </w:p>
-        </w:tc>
-        <w:tc>
-          <w:tcPr>
-            <w:tcW w:type="dxa" w:w="3100"/>
-            <w:tcMar>
-              <w:top w:w="80" w:type="dxa"/>
-              <w:start w:w="120" w:type="dxa"/>
-              <w:bottom w:w="80" w:type="dxa"/>
-              <w:end w:w="120" w:type="dxa"/>
-            </w:tcMar>
-            <w:vAlign w:val="center"/>
-          </w:tcPr>
-          <w:p>
-            <w:pPr>
-              <w:spacing w:after="0"/>
-              <w:jc w:val="left"/>
-            </w:pPr>
-            <w:r>
-              <w:rPr>
-                <w:rFonts w:ascii="Calibri" w:hAnsi="Calibri" w:eastAsia="Microsoft JhengHei"/>
-                <w:b w:val="0"/>
-                <w:color w:val="000000"/>
-                <w:sz w:val="19"/>
-              </w:rPr>
-              <w:t>Bike: VO2 Max 5x1</w:t>
-            </w:r>
-          </w:p>
-        </w:tc>
-        <w:tc>
-          <w:tcPr>
-            <w:tcW w:type="dxa" w:w="1100"/>
-            <w:tcMar>
-              <w:top w:w="80" w:type="dxa"/>
-              <w:start w:w="120" w:type="dxa"/>
-              <w:bottom w:w="80" w:type="dxa"/>
-              <w:end w:w="120" w:type="dxa"/>
-            </w:tcMar>
-            <w:vAlign w:val="center"/>
-          </w:tcPr>
-          <w:p>
-            <w:pPr>
-              <w:spacing w:after="0"/>
-              <w:jc w:val="center"/>
-            </w:pPr>
-            <w:r>
-              <w:rPr>
-                <w:rFonts w:ascii="Calibri" w:hAnsi="Calibri" w:eastAsia="Microsoft JhengHei"/>
-                <w:b w:val="0"/>
-                <w:color w:val="000000"/>
-                <w:sz w:val="19"/>
-              </w:rPr>
-              <w:t>Bike</w:t>
-            </w:r>
-          </w:p>
-        </w:tc>
-        <w:tc>
-          <w:tcPr>
-            <w:tcW w:type="dxa" w:w="1600"/>
-            <w:tcMar>
-              <w:top w:w="80" w:type="dxa"/>
-              <w:start w:w="120" w:type="dxa"/>
-              <w:bottom w:w="80" w:type="dxa"/>
-              <w:end w:w="120" w:type="dxa"/>
-            </w:tcMar>
-            <w:vAlign w:val="center"/>
-          </w:tcPr>
-          <w:p>
-            <w:pPr>
-              <w:spacing w:after="0"/>
-              <w:jc w:val="center"/>
-            </w:pPr>
-            <w:r>
-              <w:rPr>
-                <w:rFonts w:ascii="Calibri" w:hAnsi="Calibri" w:eastAsia="Microsoft JhengHei"/>
-                <w:b w:val="0"/>
-                <w:color w:val="000000"/>
-                <w:sz w:val="19"/>
-              </w:rPr>
-              <w:t>60分</w:t>
-            </w:r>
-          </w:p>
-        </w:tc>
-        <w:tc>
-          <w:tcPr>
-            <w:tcW w:type="dxa" w:w="1600"/>
-            <w:tcMar>
-              <w:top w:w="80" w:type="dxa"/>
-              <w:start w:w="120" w:type="dxa"/>
-              <w:bottom w:w="80" w:type="dxa"/>
-              <w:end w:w="120" w:type="dxa"/>
-            </w:tcMar>
-            <w:vAlign w:val="center"/>
-          </w:tcPr>
-          <w:p>
-            <w:pPr>
-              <w:spacing w:after="0"/>
-              <w:jc w:val="center"/>
-            </w:pPr>
-            <w:r>
-              <w:rPr>
-                <w:rFonts w:ascii="Calibri" w:hAnsi="Calibri" w:eastAsia="Microsoft JhengHei"/>
-                <w:b w:val="0"/>
-                <w:color w:val="000000"/>
-                <w:sz w:val="19"/>
-              </w:rPr>
-              <w:t>0分</w:t>
-            </w:r>
-          </w:p>
-        </w:tc>
-        <w:tc>
-          <w:tcPr>
-            <w:tcW w:type="dxa" w:w="1160"/>
-            <w:tcMar>
-              <w:top w:w="80" w:type="dxa"/>
-              <w:start w:w="120" w:type="dxa"/>
-              <w:bottom w:w="80" w:type="dxa"/>
-              <w:end w:w="120" w:type="dxa"/>
-            </w:tcMar>
-            <w:vAlign w:val="center"/>
-          </w:tcPr>
-          <w:p>
-            <w:pPr>
-              <w:spacing w:after="0"/>
-              <w:jc w:val="center"/>
-            </w:pPr>
-            <w:r>
-              <w:rPr>
-                <w:rFonts w:ascii="Calibri" w:hAnsi="Calibri" w:eastAsia="Microsoft JhengHei"/>
-                <w:b w:val="0"/>
-                <w:color w:val="000000"/>
-                <w:sz w:val="19"/>
-              </w:rPr>
-              <w:t>❌ 未執行</w:t>
+              <w:t>✅ 已完成</w:t>
             </w:r>
           </w:p>
         </w:tc>

</xml_diff>

<commit_message>
Auto Daily 8:00 PM Dashboard Update [2026-08-12 20:00]
</commit_message>
<xml_diff>
--- a/docs/weekly/2026-W33_當週執行率回顧報告.docx
+++ b/docs/weekly/2026-W33_當週執行率回顧報告.docx
@@ -21,7 +21,7 @@
           <w:color w:val="555555"/>
           <w:sz w:val="20"/>
         </w:rPr>
-        <w:t>週期：2026/08/10–2026/08/16　｜　整體時間執行率：9.0%</w:t>
+        <w:t>週期：2026/08/10–2026/08/16　｜　整體時間執行率：22.7%</w:t>
       </w:r>
     </w:p>
     <w:p>
@@ -347,7 +347,7 @@
                 <w:color w:val="000000"/>
                 <w:sz w:val="19"/>
               </w:rPr>
-              <w:t>0.00 hr</w:t>
+              <w:t>1.10 hr</w:t>
             </w:r>
           </w:p>
         </w:tc>
@@ -374,7 +374,7 @@
                 <w:color w:val="000000"/>
                 <w:sz w:val="19"/>
               </w:rPr>
-              <w:t>0.0%</w:t>
+              <w:t>26.4%</w:t>
             </w:r>
           </w:p>
         </w:tc>
@@ -428,7 +428,7 @@
                 <w:color w:val="000000"/>
                 <w:sz w:val="19"/>
               </w:rPr>
-              <w:t>0.00 km</w:t>
+              <w:t>3.30 km</w:t>
             </w:r>
           </w:p>
         </w:tc>
@@ -455,7 +455,7 @@
                 <w:color w:val="000000"/>
                 <w:sz w:val="19"/>
               </w:rPr>
-              <w:t>0.0%</w:t>
+              <w:t>78.6%</w:t>
             </w:r>
           </w:p>
         </w:tc>
@@ -756,7 +756,7 @@
                 <w:color w:val="000000"/>
                 <w:sz w:val="19"/>
               </w:rPr>
-              <w:t>5.83 hr</w:t>
+              <w:t>7.33 hr</w:t>
             </w:r>
           </w:p>
         </w:tc>
@@ -783,7 +783,7 @@
                 <w:color w:val="000000"/>
                 <w:sz w:val="19"/>
               </w:rPr>
-              <w:t>1.43 hr</w:t>
+              <w:t>2.87 hr</w:t>
             </w:r>
           </w:p>
         </w:tc>
@@ -810,7 +810,7 @@
                 <w:color w:val="000000"/>
                 <w:sz w:val="19"/>
               </w:rPr>
-              <w:t>24.6%</w:t>
+              <w:t>39.1%</w:t>
             </w:r>
           </w:p>
         </w:tc>
@@ -837,7 +837,7 @@
                 <w:color w:val="000000"/>
                 <w:sz w:val="19"/>
               </w:rPr>
-              <w:t>51.60 km</w:t>
+              <w:t>63.20 km</w:t>
             </w:r>
           </w:p>
         </w:tc>
@@ -864,7 +864,7 @@
                 <w:color w:val="000000"/>
                 <w:sz w:val="19"/>
               </w:rPr>
-              <w:t>11.92 km</w:t>
+              <w:t>23.84 km</w:t>
             </w:r>
           </w:p>
         </w:tc>
@@ -891,7 +891,7 @@
                 <w:color w:val="000000"/>
                 <w:sz w:val="19"/>
               </w:rPr>
-              <w:t>23.1%</w:t>
+              <w:t>37.7%</w:t>
             </w:r>
           </w:p>
         </w:tc>
@@ -918,7 +918,7 @@
                 <w:color w:val="000000"/>
                 <w:sz w:val="19"/>
               </w:rPr>
-              <w:t>4</w:t>
+              <w:t>5</w:t>
             </w:r>
           </w:p>
         </w:tc>
@@ -1687,6 +1687,172 @@
                 <w:color w:val="000000"/>
                 <w:sz w:val="19"/>
               </w:rPr>
+              <w:t>08/11</w:t>
+              <w:br/>
+              <w:t>週二</w:t>
+            </w:r>
+          </w:p>
+        </w:tc>
+        <w:tc>
+          <w:tcPr>
+            <w:tcW w:type="dxa" w:w="3100"/>
+            <w:tcMar>
+              <w:top w:w="80" w:type="dxa"/>
+              <w:start w:w="120" w:type="dxa"/>
+              <w:bottom w:w="80" w:type="dxa"/>
+              <w:end w:w="120" w:type="dxa"/>
+            </w:tcMar>
+            <w:vAlign w:val="center"/>
+          </w:tcPr>
+          <w:p>
+            <w:pPr>
+              <w:spacing w:after="0"/>
+              <w:jc w:val="left"/>
+            </w:pPr>
+            <w:r>
+              <w:rPr>
+                <w:rFonts w:ascii="Calibri" w:hAnsi="Calibri" w:eastAsia="Microsoft JhengHei"/>
+                <w:b w:val="0"/>
+                <w:color w:val="000000"/>
+                <w:sz w:val="19"/>
+              </w:rPr>
+              <w:t>Run: Running</w:t>
+            </w:r>
+          </w:p>
+        </w:tc>
+        <w:tc>
+          <w:tcPr>
+            <w:tcW w:type="dxa" w:w="1100"/>
+            <w:tcMar>
+              <w:top w:w="80" w:type="dxa"/>
+              <w:start w:w="120" w:type="dxa"/>
+              <w:bottom w:w="80" w:type="dxa"/>
+              <w:end w:w="120" w:type="dxa"/>
+            </w:tcMar>
+            <w:vAlign w:val="center"/>
+          </w:tcPr>
+          <w:p>
+            <w:pPr>
+              <w:spacing w:after="0"/>
+              <w:jc w:val="center"/>
+            </w:pPr>
+            <w:r>
+              <w:rPr>
+                <w:rFonts w:ascii="Calibri" w:hAnsi="Calibri" w:eastAsia="Microsoft JhengHei"/>
+                <w:b w:val="0"/>
+                <w:color w:val="000000"/>
+                <w:sz w:val="19"/>
+              </w:rPr>
+              <w:t>Run</w:t>
+            </w:r>
+          </w:p>
+        </w:tc>
+        <w:tc>
+          <w:tcPr>
+            <w:tcW w:type="dxa" w:w="1600"/>
+            <w:tcMar>
+              <w:top w:w="80" w:type="dxa"/>
+              <w:start w:w="120" w:type="dxa"/>
+              <w:bottom w:w="80" w:type="dxa"/>
+              <w:end w:w="120" w:type="dxa"/>
+            </w:tcMar>
+            <w:vAlign w:val="center"/>
+          </w:tcPr>
+          <w:p>
+            <w:pPr>
+              <w:spacing w:after="0"/>
+              <w:jc w:val="center"/>
+            </w:pPr>
+            <w:r>
+              <w:rPr>
+                <w:rFonts w:ascii="Calibri" w:hAnsi="Calibri" w:eastAsia="Microsoft JhengHei"/>
+                <w:b w:val="0"/>
+                <w:color w:val="000000"/>
+                <w:sz w:val="19"/>
+              </w:rPr>
+              <w:t>90分 / 11.60km</w:t>
+            </w:r>
+          </w:p>
+        </w:tc>
+        <w:tc>
+          <w:tcPr>
+            <w:tcW w:type="dxa" w:w="1600"/>
+            <w:tcMar>
+              <w:top w:w="80" w:type="dxa"/>
+              <w:start w:w="120" w:type="dxa"/>
+              <w:bottom w:w="80" w:type="dxa"/>
+              <w:end w:w="120" w:type="dxa"/>
+            </w:tcMar>
+            <w:vAlign w:val="center"/>
+          </w:tcPr>
+          <w:p>
+            <w:pPr>
+              <w:spacing w:after="0"/>
+              <w:jc w:val="center"/>
+            </w:pPr>
+            <w:r>
+              <w:rPr>
+                <w:rFonts w:ascii="Calibri" w:hAnsi="Calibri" w:eastAsia="Microsoft JhengHei"/>
+                <w:b w:val="0"/>
+                <w:color w:val="000000"/>
+                <w:sz w:val="19"/>
+              </w:rPr>
+              <w:t>86分 / 11.92km</w:t>
+            </w:r>
+          </w:p>
+        </w:tc>
+        <w:tc>
+          <w:tcPr>
+            <w:tcW w:type="dxa" w:w="1160"/>
+            <w:tcMar>
+              <w:top w:w="80" w:type="dxa"/>
+              <w:start w:w="120" w:type="dxa"/>
+              <w:bottom w:w="80" w:type="dxa"/>
+              <w:end w:w="120" w:type="dxa"/>
+            </w:tcMar>
+            <w:vAlign w:val="center"/>
+          </w:tcPr>
+          <w:p>
+            <w:pPr>
+              <w:spacing w:after="0"/>
+              <w:jc w:val="center"/>
+            </w:pPr>
+            <w:r>
+              <w:rPr>
+                <w:rFonts w:ascii="Calibri" w:hAnsi="Calibri" w:eastAsia="Microsoft JhengHei"/>
+                <w:b w:val="0"/>
+                <w:color w:val="000000"/>
+                <w:sz w:val="19"/>
+              </w:rPr>
+              <w:t>✅ 已完成</w:t>
+            </w:r>
+          </w:p>
+        </w:tc>
+      </w:tr>
+      <w:tr>
+        <w:tc>
+          <w:tcPr>
+            <w:tcW w:type="dxa" w:w="1100"/>
+            <w:tcMar>
+              <w:top w:w="80" w:type="dxa"/>
+              <w:start w:w="120" w:type="dxa"/>
+              <w:bottom w:w="80" w:type="dxa"/>
+              <w:end w:w="120" w:type="dxa"/>
+            </w:tcMar>
+            <w:vAlign w:val="center"/>
+          </w:tcPr>
+          <w:p>
+            <w:pPr>
+              <w:spacing w:after="0"/>
+              <w:jc w:val="center"/>
+            </w:pPr>
+            <w:r>
+              <w:rPr>
+                <w:rFonts w:ascii="Calibri" w:hAnsi="Calibri" w:eastAsia="Microsoft JhengHei"/>
+                <w:b w:val="0"/>
+                <w:color w:val="000000"/>
+                <w:sz w:val="19"/>
+              </w:rPr>
               <w:t>08/12</w:t>
               <w:br/>
               <w:t>週三</w:t>
@@ -1797,7 +1963,7 @@
                 <w:color w:val="000000"/>
                 <w:sz w:val="19"/>
               </w:rPr>
-              <w:t>0分</w:t>
+              <w:t>66分 / 3.30km</w:t>
             </w:r>
           </w:p>
         </w:tc>
@@ -1824,7 +1990,7 @@
                 <w:color w:val="000000"/>
                 <w:sz w:val="19"/>
               </w:rPr>
-              <w:t>❌ 未執行</w:t>
+              <w:t>✅ 已完成</w:t>
             </w:r>
           </w:p>
         </w:tc>

</xml_diff>

<commit_message>
Auto Daily 8:00 PM Dashboard Update [2026-08-13 20:00]
</commit_message>
<xml_diff>
--- a/docs/weekly/2026-W33_當週執行率回顧報告.docx
+++ b/docs/weekly/2026-W33_當週執行率回顧報告.docx
@@ -21,7 +21,7 @@
           <w:color w:val="555555"/>
           <w:sz w:val="20"/>
         </w:rPr>
-        <w:t>週期：2026/08/10–2026/08/16　｜　整體時間執行率：22.7%</w:t>
+        <w:t>週期：2026/08/10–2026/08/16　｜　整體時間執行率：49.4%</w:t>
       </w:r>
     </w:p>
     <w:p>
@@ -320,7 +320,7 @@
                 <w:color w:val="000000"/>
                 <w:sz w:val="19"/>
               </w:rPr>
-              <w:t>4.17 hr</w:t>
+              <w:t>5.50 hr</w:t>
             </w:r>
           </w:p>
         </w:tc>
@@ -347,7 +347,7 @@
                 <w:color w:val="000000"/>
                 <w:sz w:val="19"/>
               </w:rPr>
-              <w:t>1.10 hr</w:t>
+              <w:t>2.20 hr</w:t>
             </w:r>
           </w:p>
         </w:tc>
@@ -374,7 +374,7 @@
                 <w:color w:val="000000"/>
                 <w:sz w:val="19"/>
               </w:rPr>
-              <w:t>26.4%</w:t>
+              <w:t>40.0%</w:t>
             </w:r>
           </w:p>
         </w:tc>
@@ -428,7 +428,7 @@
                 <w:color w:val="000000"/>
                 <w:sz w:val="19"/>
               </w:rPr>
-              <w:t>3.30 km</w:t>
+              <w:t>6.60 km</w:t>
             </w:r>
           </w:p>
         </w:tc>
@@ -455,7 +455,7 @@
                 <w:color w:val="000000"/>
                 <w:sz w:val="19"/>
               </w:rPr>
-              <w:t>78.6%</w:t>
+              <w:t>157.1%</w:t>
             </w:r>
           </w:p>
         </w:tc>
@@ -482,7 +482,7 @@
                 <w:color w:val="000000"/>
                 <w:sz w:val="19"/>
               </w:rPr>
-              <w:t>3</w:t>
+              <w:t>4</w:t>
             </w:r>
           </w:p>
         </w:tc>
@@ -565,7 +565,7 @@
                 <w:color w:val="000000"/>
                 <w:sz w:val="19"/>
               </w:rPr>
-              <w:t>0.00 hr</w:t>
+              <w:t>3.23 hr</w:t>
             </w:r>
           </w:p>
         </w:tc>
@@ -592,7 +592,7 @@
                 <w:color w:val="000000"/>
                 <w:sz w:val="19"/>
               </w:rPr>
-              <w:t>0.0%</w:t>
+              <w:t>53.9%</w:t>
             </w:r>
           </w:p>
         </w:tc>
@@ -646,7 +646,7 @@
                 <w:color w:val="000000"/>
                 <w:sz w:val="19"/>
               </w:rPr>
-              <w:t>0.00 km</w:t>
+              <w:t>60.99 km</w:t>
             </w:r>
           </w:p>
         </w:tc>
@@ -756,7 +756,7 @@
                 <w:color w:val="000000"/>
                 <w:sz w:val="19"/>
               </w:rPr>
-              <w:t>7.33 hr</w:t>
+              <w:t>8.83 hr</w:t>
             </w:r>
           </w:p>
         </w:tc>
@@ -783,7 +783,7 @@
                 <w:color w:val="000000"/>
                 <w:sz w:val="19"/>
               </w:rPr>
-              <w:t>2.87 hr</w:t>
+              <w:t>4.62 hr</w:t>
             </w:r>
           </w:p>
         </w:tc>
@@ -810,7 +810,7 @@
                 <w:color w:val="000000"/>
                 <w:sz w:val="19"/>
               </w:rPr>
-              <w:t>39.1%</w:t>
+              <w:t>52.3%</w:t>
             </w:r>
           </w:p>
         </w:tc>
@@ -837,7 +837,7 @@
                 <w:color w:val="000000"/>
                 <w:sz w:val="19"/>
               </w:rPr>
-              <w:t>63.20 km</w:t>
+              <w:t>74.80 km</w:t>
             </w:r>
           </w:p>
         </w:tc>
@@ -864,7 +864,7 @@
                 <w:color w:val="000000"/>
                 <w:sz w:val="19"/>
               </w:rPr>
-              <w:t>23.84 km</w:t>
+              <w:t>39.24 km</w:t>
             </w:r>
           </w:p>
         </w:tc>
@@ -891,7 +891,7 @@
                 <w:color w:val="000000"/>
                 <w:sz w:val="19"/>
               </w:rPr>
-              <w:t>37.7%</w:t>
+              <w:t>52.5%</w:t>
             </w:r>
           </w:p>
         </w:tc>
@@ -918,7 +918,7 @@
                 <w:color w:val="000000"/>
                 <w:sz w:val="19"/>
               </w:rPr>
-              <w:t>5</w:t>
+              <w:t>6</w:t>
             </w:r>
           </w:p>
         </w:tc>
@@ -1853,6 +1853,338 @@
                 <w:color w:val="000000"/>
                 <w:sz w:val="19"/>
               </w:rPr>
+              <w:t>08/11</w:t>
+              <w:br/>
+              <w:t>週二</w:t>
+            </w:r>
+          </w:p>
+        </w:tc>
+        <w:tc>
+          <w:tcPr>
+            <w:tcW w:type="dxa" w:w="3100"/>
+            <w:tcMar>
+              <w:top w:w="80" w:type="dxa"/>
+              <w:start w:w="120" w:type="dxa"/>
+              <w:bottom w:w="80" w:type="dxa"/>
+              <w:end w:w="120" w:type="dxa"/>
+            </w:tcMar>
+            <w:vAlign w:val="center"/>
+          </w:tcPr>
+          <w:p>
+            <w:pPr>
+              <w:spacing w:after="0"/>
+              <w:jc w:val="left"/>
+            </w:pPr>
+            <w:r>
+              <w:rPr>
+                <w:rFonts w:ascii="Calibri" w:hAnsi="Calibri" w:eastAsia="Microsoft JhengHei"/>
+                <w:b w:val="0"/>
+                <w:color w:val="000000"/>
+                <w:sz w:val="19"/>
+              </w:rPr>
+              <w:t>Run: Running</w:t>
+            </w:r>
+          </w:p>
+        </w:tc>
+        <w:tc>
+          <w:tcPr>
+            <w:tcW w:type="dxa" w:w="1100"/>
+            <w:tcMar>
+              <w:top w:w="80" w:type="dxa"/>
+              <w:start w:w="120" w:type="dxa"/>
+              <w:bottom w:w="80" w:type="dxa"/>
+              <w:end w:w="120" w:type="dxa"/>
+            </w:tcMar>
+            <w:vAlign w:val="center"/>
+          </w:tcPr>
+          <w:p>
+            <w:pPr>
+              <w:spacing w:after="0"/>
+              <w:jc w:val="center"/>
+            </w:pPr>
+            <w:r>
+              <w:rPr>
+                <w:rFonts w:ascii="Calibri" w:hAnsi="Calibri" w:eastAsia="Microsoft JhengHei"/>
+                <w:b w:val="0"/>
+                <w:color w:val="000000"/>
+                <w:sz w:val="19"/>
+              </w:rPr>
+              <w:t>Run</w:t>
+            </w:r>
+          </w:p>
+        </w:tc>
+        <w:tc>
+          <w:tcPr>
+            <w:tcW w:type="dxa" w:w="1600"/>
+            <w:tcMar>
+              <w:top w:w="80" w:type="dxa"/>
+              <w:start w:w="120" w:type="dxa"/>
+              <w:bottom w:w="80" w:type="dxa"/>
+              <w:end w:w="120" w:type="dxa"/>
+            </w:tcMar>
+            <w:vAlign w:val="center"/>
+          </w:tcPr>
+          <w:p>
+            <w:pPr>
+              <w:spacing w:after="0"/>
+              <w:jc w:val="center"/>
+            </w:pPr>
+            <w:r>
+              <w:rPr>
+                <w:rFonts w:ascii="Calibri" w:hAnsi="Calibri" w:eastAsia="Microsoft JhengHei"/>
+                <w:b w:val="0"/>
+                <w:color w:val="000000"/>
+                <w:sz w:val="19"/>
+              </w:rPr>
+              <w:t>90分 / 11.60km</w:t>
+            </w:r>
+          </w:p>
+        </w:tc>
+        <w:tc>
+          <w:tcPr>
+            <w:tcW w:type="dxa" w:w="1600"/>
+            <w:tcMar>
+              <w:top w:w="80" w:type="dxa"/>
+              <w:start w:w="120" w:type="dxa"/>
+              <w:bottom w:w="80" w:type="dxa"/>
+              <w:end w:w="120" w:type="dxa"/>
+            </w:tcMar>
+            <w:vAlign w:val="center"/>
+          </w:tcPr>
+          <w:p>
+            <w:pPr>
+              <w:spacing w:after="0"/>
+              <w:jc w:val="center"/>
+            </w:pPr>
+            <w:r>
+              <w:rPr>
+                <w:rFonts w:ascii="Calibri" w:hAnsi="Calibri" w:eastAsia="Microsoft JhengHei"/>
+                <w:b w:val="0"/>
+                <w:color w:val="000000"/>
+                <w:sz w:val="19"/>
+              </w:rPr>
+              <w:t>86分 / 11.92km</w:t>
+            </w:r>
+          </w:p>
+        </w:tc>
+        <w:tc>
+          <w:tcPr>
+            <w:tcW w:type="dxa" w:w="1160"/>
+            <w:tcMar>
+              <w:top w:w="80" w:type="dxa"/>
+              <w:start w:w="120" w:type="dxa"/>
+              <w:bottom w:w="80" w:type="dxa"/>
+              <w:end w:w="120" w:type="dxa"/>
+            </w:tcMar>
+            <w:vAlign w:val="center"/>
+          </w:tcPr>
+          <w:p>
+            <w:pPr>
+              <w:spacing w:after="0"/>
+              <w:jc w:val="center"/>
+            </w:pPr>
+            <w:r>
+              <w:rPr>
+                <w:rFonts w:ascii="Calibri" w:hAnsi="Calibri" w:eastAsia="Microsoft JhengHei"/>
+                <w:b w:val="0"/>
+                <w:color w:val="000000"/>
+                <w:sz w:val="19"/>
+              </w:rPr>
+              <w:t>✅ 已完成</w:t>
+            </w:r>
+          </w:p>
+        </w:tc>
+      </w:tr>
+      <w:tr>
+        <w:tc>
+          <w:tcPr>
+            <w:tcW w:type="dxa" w:w="1100"/>
+            <w:tcMar>
+              <w:top w:w="80" w:type="dxa"/>
+              <w:start w:w="120" w:type="dxa"/>
+              <w:bottom w:w="80" w:type="dxa"/>
+              <w:end w:w="120" w:type="dxa"/>
+            </w:tcMar>
+            <w:vAlign w:val="center"/>
+          </w:tcPr>
+          <w:p>
+            <w:pPr>
+              <w:spacing w:after="0"/>
+              <w:jc w:val="center"/>
+            </w:pPr>
+            <w:r>
+              <w:rPr>
+                <w:rFonts w:ascii="Calibri" w:hAnsi="Calibri" w:eastAsia="Microsoft JhengHei"/>
+                <w:b w:val="0"/>
+                <w:color w:val="000000"/>
+                <w:sz w:val="19"/>
+              </w:rPr>
+              <w:t>08/12</w:t>
+              <w:br/>
+              <w:t>週三</w:t>
+            </w:r>
+          </w:p>
+        </w:tc>
+        <w:tc>
+          <w:tcPr>
+            <w:tcW w:type="dxa" w:w="3100"/>
+            <w:tcMar>
+              <w:top w:w="80" w:type="dxa"/>
+              <w:start w:w="120" w:type="dxa"/>
+              <w:bottom w:w="80" w:type="dxa"/>
+              <w:end w:w="120" w:type="dxa"/>
+            </w:tcMar>
+            <w:vAlign w:val="center"/>
+          </w:tcPr>
+          <w:p>
+            <w:pPr>
+              <w:spacing w:after="0"/>
+              <w:jc w:val="left"/>
+            </w:pPr>
+            <w:r>
+              <w:rPr>
+                <w:rFonts w:ascii="Calibri" w:hAnsi="Calibri" w:eastAsia="Microsoft JhengHei"/>
+                <w:b w:val="0"/>
+                <w:color w:val="000000"/>
+                <w:sz w:val="19"/>
+              </w:rPr>
+              <w:t>Swim: 甜甜課表</w:t>
+            </w:r>
+          </w:p>
+        </w:tc>
+        <w:tc>
+          <w:tcPr>
+            <w:tcW w:type="dxa" w:w="1100"/>
+            <w:tcMar>
+              <w:top w:w="80" w:type="dxa"/>
+              <w:start w:w="120" w:type="dxa"/>
+              <w:bottom w:w="80" w:type="dxa"/>
+              <w:end w:w="120" w:type="dxa"/>
+            </w:tcMar>
+            <w:vAlign w:val="center"/>
+          </w:tcPr>
+          <w:p>
+            <w:pPr>
+              <w:spacing w:after="0"/>
+              <w:jc w:val="center"/>
+            </w:pPr>
+            <w:r>
+              <w:rPr>
+                <w:rFonts w:ascii="Calibri" w:hAnsi="Calibri" w:eastAsia="Microsoft JhengHei"/>
+                <w:b w:val="0"/>
+                <w:color w:val="000000"/>
+                <w:sz w:val="19"/>
+              </w:rPr>
+              <w:t>Swim</w:t>
+            </w:r>
+          </w:p>
+        </w:tc>
+        <w:tc>
+          <w:tcPr>
+            <w:tcW w:type="dxa" w:w="1600"/>
+            <w:tcMar>
+              <w:top w:w="80" w:type="dxa"/>
+              <w:start w:w="120" w:type="dxa"/>
+              <w:bottom w:w="80" w:type="dxa"/>
+              <w:end w:w="120" w:type="dxa"/>
+            </w:tcMar>
+            <w:vAlign w:val="center"/>
+          </w:tcPr>
+          <w:p>
+            <w:pPr>
+              <w:spacing w:after="0"/>
+              <w:jc w:val="center"/>
+            </w:pPr>
+            <w:r>
+              <w:rPr>
+                <w:rFonts w:ascii="Calibri" w:hAnsi="Calibri" w:eastAsia="Microsoft JhengHei"/>
+                <w:b w:val="0"/>
+                <w:color w:val="000000"/>
+                <w:sz w:val="19"/>
+              </w:rPr>
+              <w:t>80分</w:t>
+            </w:r>
+          </w:p>
+        </w:tc>
+        <w:tc>
+          <w:tcPr>
+            <w:tcW w:type="dxa" w:w="1600"/>
+            <w:tcMar>
+              <w:top w:w="80" w:type="dxa"/>
+              <w:start w:w="120" w:type="dxa"/>
+              <w:bottom w:w="80" w:type="dxa"/>
+              <w:end w:w="120" w:type="dxa"/>
+            </w:tcMar>
+            <w:vAlign w:val="center"/>
+          </w:tcPr>
+          <w:p>
+            <w:pPr>
+              <w:spacing w:after="0"/>
+              <w:jc w:val="center"/>
+            </w:pPr>
+            <w:r>
+              <w:rPr>
+                <w:rFonts w:ascii="Calibri" w:hAnsi="Calibri" w:eastAsia="Microsoft JhengHei"/>
+                <w:b w:val="0"/>
+                <w:color w:val="000000"/>
+                <w:sz w:val="19"/>
+              </w:rPr>
+              <w:t>66分 / 3.30km</w:t>
+            </w:r>
+          </w:p>
+        </w:tc>
+        <w:tc>
+          <w:tcPr>
+            <w:tcW w:type="dxa" w:w="1160"/>
+            <w:tcMar>
+              <w:top w:w="80" w:type="dxa"/>
+              <w:start w:w="120" w:type="dxa"/>
+              <w:bottom w:w="80" w:type="dxa"/>
+              <w:end w:w="120" w:type="dxa"/>
+            </w:tcMar>
+            <w:vAlign w:val="center"/>
+          </w:tcPr>
+          <w:p>
+            <w:pPr>
+              <w:spacing w:after="0"/>
+              <w:jc w:val="center"/>
+            </w:pPr>
+            <w:r>
+              <w:rPr>
+                <w:rFonts w:ascii="Calibri" w:hAnsi="Calibri" w:eastAsia="Microsoft JhengHei"/>
+                <w:b w:val="0"/>
+                <w:color w:val="000000"/>
+                <w:sz w:val="19"/>
+              </w:rPr>
+              <w:t>✅ 已完成</w:t>
+            </w:r>
+          </w:p>
+        </w:tc>
+      </w:tr>
+      <w:tr>
+        <w:tc>
+          <w:tcPr>
+            <w:tcW w:type="dxa" w:w="1100"/>
+            <w:tcMar>
+              <w:top w:w="80" w:type="dxa"/>
+              <w:start w:w="120" w:type="dxa"/>
+              <w:bottom w:w="80" w:type="dxa"/>
+              <w:end w:w="120" w:type="dxa"/>
+            </w:tcMar>
+            <w:vAlign w:val="center"/>
+          </w:tcPr>
+          <w:p>
+            <w:pPr>
+              <w:spacing w:after="0"/>
+              <w:jc w:val="center"/>
+            </w:pPr>
+            <w:r>
+              <w:rPr>
+                <w:rFonts w:ascii="Calibri" w:hAnsi="Calibri" w:eastAsia="Microsoft JhengHei"/>
+                <w:b w:val="0"/>
+                <w:color w:val="000000"/>
+                <w:sz w:val="19"/>
+              </w:rPr>
               <w:t>08/12</w:t>
               <w:br/>
               <w:t>週三</w:t>
@@ -2129,7 +2461,7 @@
                 <w:color w:val="000000"/>
                 <w:sz w:val="19"/>
               </w:rPr>
-              <w:t>0分</w:t>
+              <w:t>194分 / 60.99km</w:t>
             </w:r>
           </w:p>
         </w:tc>
@@ -2156,7 +2488,7 @@
                 <w:color w:val="000000"/>
                 <w:sz w:val="19"/>
               </w:rPr>
-              <w:t>❌ 未執行</w:t>
+              <w:t>✅ 已完成</w:t>
             </w:r>
           </w:p>
         </w:tc>
@@ -2295,7 +2627,7 @@
                 <w:color w:val="000000"/>
                 <w:sz w:val="19"/>
               </w:rPr>
-              <w:t>0分</w:t>
+              <w:t>19分 / 3.48km</w:t>
             </w:r>
           </w:p>
         </w:tc>
@@ -2322,7 +2654,7 @@
                 <w:color w:val="000000"/>
                 <w:sz w:val="19"/>
               </w:rPr>
-              <w:t>❌ 未執行</w:t>
+              <w:t>✅ 已完成</w:t>
             </w:r>
           </w:p>
         </w:tc>

</xml_diff>

<commit_message>
Fix duplicate calendar entry bug in sync_calendar.py and recalculate rolling stats
</commit_message>
<xml_diff>
--- a/docs/weekly/2026-W33_當週執行率回顧報告.docx
+++ b/docs/weekly/2026-W33_當週執行率回顧報告.docx
@@ -21,7 +21,7 @@
           <w:color w:val="555555"/>
           <w:sz w:val="20"/>
         </w:rPr>
-        <w:t>週期：2026/08/10–2026/08/16　｜　整體時間執行率：49.4%</w:t>
+        <w:t>週期：2026/08/10–2026/08/16　｜　整體時間執行率：38.0%</w:t>
       </w:r>
     </w:p>
     <w:p>
@@ -320,7 +320,7 @@
                 <w:color w:val="000000"/>
                 <w:sz w:val="19"/>
               </w:rPr>
-              <w:t>5.50 hr</w:t>
+              <w:t>4.17 hr</w:t>
             </w:r>
           </w:p>
         </w:tc>
@@ -347,7 +347,7 @@
                 <w:color w:val="000000"/>
                 <w:sz w:val="19"/>
               </w:rPr>
-              <w:t>2.20 hr</w:t>
+              <w:t>1.10 hr</w:t>
             </w:r>
           </w:p>
         </w:tc>
@@ -374,7 +374,7 @@
                 <w:color w:val="000000"/>
                 <w:sz w:val="19"/>
               </w:rPr>
-              <w:t>40.0%</w:t>
+              <w:t>26.4%</w:t>
             </w:r>
           </w:p>
         </w:tc>
@@ -428,7 +428,7 @@
                 <w:color w:val="000000"/>
                 <w:sz w:val="19"/>
               </w:rPr>
-              <w:t>6.60 km</w:t>
+              <w:t>3.30 km</w:t>
             </w:r>
           </w:p>
         </w:tc>
@@ -455,7 +455,7 @@
                 <w:color w:val="000000"/>
                 <w:sz w:val="19"/>
               </w:rPr>
-              <w:t>157.1%</w:t>
+              <w:t>78.6%</w:t>
             </w:r>
           </w:p>
         </w:tc>
@@ -482,7 +482,7 @@
                 <w:color w:val="000000"/>
                 <w:sz w:val="19"/>
               </w:rPr>
-              <w:t>4</w:t>
+              <w:t>3</w:t>
             </w:r>
           </w:p>
         </w:tc>
@@ -756,7 +756,7 @@
                 <w:color w:val="000000"/>
                 <w:sz w:val="19"/>
               </w:rPr>
-              <w:t>8.83 hr</w:t>
+              <w:t>5.83 hr</w:t>
             </w:r>
           </w:p>
         </w:tc>
@@ -783,7 +783,7 @@
                 <w:color w:val="000000"/>
                 <w:sz w:val="19"/>
               </w:rPr>
-              <w:t>4.62 hr</w:t>
+              <w:t>1.75 hr</w:t>
             </w:r>
           </w:p>
         </w:tc>
@@ -810,7 +810,7 @@
                 <w:color w:val="000000"/>
                 <w:sz w:val="19"/>
               </w:rPr>
-              <w:t>52.3%</w:t>
+              <w:t>30.0%</w:t>
             </w:r>
           </w:p>
         </w:tc>
@@ -837,7 +837,7 @@
                 <w:color w:val="000000"/>
                 <w:sz w:val="19"/>
               </w:rPr>
-              <w:t>74.80 km</w:t>
+              <w:t>51.60 km</w:t>
             </w:r>
           </w:p>
         </w:tc>
@@ -864,7 +864,7 @@
                 <w:color w:val="000000"/>
                 <w:sz w:val="19"/>
               </w:rPr>
-              <w:t>39.24 km</w:t>
+              <w:t>15.40 km</w:t>
             </w:r>
           </w:p>
         </w:tc>
@@ -891,7 +891,7 @@
                 <w:color w:val="000000"/>
                 <w:sz w:val="19"/>
               </w:rPr>
-              <w:t>52.5%</w:t>
+              <w:t>29.8%</w:t>
             </w:r>
           </w:p>
         </w:tc>
@@ -918,7 +918,7 @@
                 <w:color w:val="000000"/>
                 <w:sz w:val="19"/>
               </w:rPr>
-              <w:t>6</w:t>
+              <w:t>4</w:t>
             </w:r>
           </w:p>
         </w:tc>
@@ -1632,504 +1632,6 @@
                 <w:sz w:val="19"/>
               </w:rPr>
               <w:t>86分 / 11.92km</w:t>
-            </w:r>
-          </w:p>
-        </w:tc>
-        <w:tc>
-          <w:tcPr>
-            <w:tcW w:type="dxa" w:w="1160"/>
-            <w:tcMar>
-              <w:top w:w="80" w:type="dxa"/>
-              <w:start w:w="120" w:type="dxa"/>
-              <w:bottom w:w="80" w:type="dxa"/>
-              <w:end w:w="120" w:type="dxa"/>
-            </w:tcMar>
-            <w:vAlign w:val="center"/>
-          </w:tcPr>
-          <w:p>
-            <w:pPr>
-              <w:spacing w:after="0"/>
-              <w:jc w:val="center"/>
-            </w:pPr>
-            <w:r>
-              <w:rPr>
-                <w:rFonts w:ascii="Calibri" w:hAnsi="Calibri" w:eastAsia="Microsoft JhengHei"/>
-                <w:b w:val="0"/>
-                <w:color w:val="000000"/>
-                <w:sz w:val="19"/>
-              </w:rPr>
-              <w:t>✅ 已完成</w:t>
-            </w:r>
-          </w:p>
-        </w:tc>
-      </w:tr>
-      <w:tr>
-        <w:tc>
-          <w:tcPr>
-            <w:tcW w:type="dxa" w:w="1100"/>
-            <w:tcMar>
-              <w:top w:w="80" w:type="dxa"/>
-              <w:start w:w="120" w:type="dxa"/>
-              <w:bottom w:w="80" w:type="dxa"/>
-              <w:end w:w="120" w:type="dxa"/>
-            </w:tcMar>
-            <w:vAlign w:val="center"/>
-          </w:tcPr>
-          <w:p>
-            <w:pPr>
-              <w:spacing w:after="0"/>
-              <w:jc w:val="center"/>
-            </w:pPr>
-            <w:r>
-              <w:rPr>
-                <w:rFonts w:ascii="Calibri" w:hAnsi="Calibri" w:eastAsia="Microsoft JhengHei"/>
-                <w:b w:val="0"/>
-                <w:color w:val="000000"/>
-                <w:sz w:val="19"/>
-              </w:rPr>
-              <w:t>08/11</w:t>
-              <w:br/>
-              <w:t>週二</w:t>
-            </w:r>
-          </w:p>
-        </w:tc>
-        <w:tc>
-          <w:tcPr>
-            <w:tcW w:type="dxa" w:w="3100"/>
-            <w:tcMar>
-              <w:top w:w="80" w:type="dxa"/>
-              <w:start w:w="120" w:type="dxa"/>
-              <w:bottom w:w="80" w:type="dxa"/>
-              <w:end w:w="120" w:type="dxa"/>
-            </w:tcMar>
-            <w:vAlign w:val="center"/>
-          </w:tcPr>
-          <w:p>
-            <w:pPr>
-              <w:spacing w:after="0"/>
-              <w:jc w:val="left"/>
-            </w:pPr>
-            <w:r>
-              <w:rPr>
-                <w:rFonts w:ascii="Calibri" w:hAnsi="Calibri" w:eastAsia="Microsoft JhengHei"/>
-                <w:b w:val="0"/>
-                <w:color w:val="000000"/>
-                <w:sz w:val="19"/>
-              </w:rPr>
-              <w:t>Run: Running</w:t>
-            </w:r>
-          </w:p>
-        </w:tc>
-        <w:tc>
-          <w:tcPr>
-            <w:tcW w:type="dxa" w:w="1100"/>
-            <w:tcMar>
-              <w:top w:w="80" w:type="dxa"/>
-              <w:start w:w="120" w:type="dxa"/>
-              <w:bottom w:w="80" w:type="dxa"/>
-              <w:end w:w="120" w:type="dxa"/>
-            </w:tcMar>
-            <w:vAlign w:val="center"/>
-          </w:tcPr>
-          <w:p>
-            <w:pPr>
-              <w:spacing w:after="0"/>
-              <w:jc w:val="center"/>
-            </w:pPr>
-            <w:r>
-              <w:rPr>
-                <w:rFonts w:ascii="Calibri" w:hAnsi="Calibri" w:eastAsia="Microsoft JhengHei"/>
-                <w:b w:val="0"/>
-                <w:color w:val="000000"/>
-                <w:sz w:val="19"/>
-              </w:rPr>
-              <w:t>Run</w:t>
-            </w:r>
-          </w:p>
-        </w:tc>
-        <w:tc>
-          <w:tcPr>
-            <w:tcW w:type="dxa" w:w="1600"/>
-            <w:tcMar>
-              <w:top w:w="80" w:type="dxa"/>
-              <w:start w:w="120" w:type="dxa"/>
-              <w:bottom w:w="80" w:type="dxa"/>
-              <w:end w:w="120" w:type="dxa"/>
-            </w:tcMar>
-            <w:vAlign w:val="center"/>
-          </w:tcPr>
-          <w:p>
-            <w:pPr>
-              <w:spacing w:after="0"/>
-              <w:jc w:val="center"/>
-            </w:pPr>
-            <w:r>
-              <w:rPr>
-                <w:rFonts w:ascii="Calibri" w:hAnsi="Calibri" w:eastAsia="Microsoft JhengHei"/>
-                <w:b w:val="0"/>
-                <w:color w:val="000000"/>
-                <w:sz w:val="19"/>
-              </w:rPr>
-              <w:t>90分 / 11.60km</w:t>
-            </w:r>
-          </w:p>
-        </w:tc>
-        <w:tc>
-          <w:tcPr>
-            <w:tcW w:type="dxa" w:w="1600"/>
-            <w:tcMar>
-              <w:top w:w="80" w:type="dxa"/>
-              <w:start w:w="120" w:type="dxa"/>
-              <w:bottom w:w="80" w:type="dxa"/>
-              <w:end w:w="120" w:type="dxa"/>
-            </w:tcMar>
-            <w:vAlign w:val="center"/>
-          </w:tcPr>
-          <w:p>
-            <w:pPr>
-              <w:spacing w:after="0"/>
-              <w:jc w:val="center"/>
-            </w:pPr>
-            <w:r>
-              <w:rPr>
-                <w:rFonts w:ascii="Calibri" w:hAnsi="Calibri" w:eastAsia="Microsoft JhengHei"/>
-                <w:b w:val="0"/>
-                <w:color w:val="000000"/>
-                <w:sz w:val="19"/>
-              </w:rPr>
-              <w:t>86分 / 11.92km</w:t>
-            </w:r>
-          </w:p>
-        </w:tc>
-        <w:tc>
-          <w:tcPr>
-            <w:tcW w:type="dxa" w:w="1160"/>
-            <w:tcMar>
-              <w:top w:w="80" w:type="dxa"/>
-              <w:start w:w="120" w:type="dxa"/>
-              <w:bottom w:w="80" w:type="dxa"/>
-              <w:end w:w="120" w:type="dxa"/>
-            </w:tcMar>
-            <w:vAlign w:val="center"/>
-          </w:tcPr>
-          <w:p>
-            <w:pPr>
-              <w:spacing w:after="0"/>
-              <w:jc w:val="center"/>
-            </w:pPr>
-            <w:r>
-              <w:rPr>
-                <w:rFonts w:ascii="Calibri" w:hAnsi="Calibri" w:eastAsia="Microsoft JhengHei"/>
-                <w:b w:val="0"/>
-                <w:color w:val="000000"/>
-                <w:sz w:val="19"/>
-              </w:rPr>
-              <w:t>✅ 已完成</w:t>
-            </w:r>
-          </w:p>
-        </w:tc>
-      </w:tr>
-      <w:tr>
-        <w:tc>
-          <w:tcPr>
-            <w:tcW w:type="dxa" w:w="1100"/>
-            <w:tcMar>
-              <w:top w:w="80" w:type="dxa"/>
-              <w:start w:w="120" w:type="dxa"/>
-              <w:bottom w:w="80" w:type="dxa"/>
-              <w:end w:w="120" w:type="dxa"/>
-            </w:tcMar>
-            <w:vAlign w:val="center"/>
-          </w:tcPr>
-          <w:p>
-            <w:pPr>
-              <w:spacing w:after="0"/>
-              <w:jc w:val="center"/>
-            </w:pPr>
-            <w:r>
-              <w:rPr>
-                <w:rFonts w:ascii="Calibri" w:hAnsi="Calibri" w:eastAsia="Microsoft JhengHei"/>
-                <w:b w:val="0"/>
-                <w:color w:val="000000"/>
-                <w:sz w:val="19"/>
-              </w:rPr>
-              <w:t>08/11</w:t>
-              <w:br/>
-              <w:t>週二</w:t>
-            </w:r>
-          </w:p>
-        </w:tc>
-        <w:tc>
-          <w:tcPr>
-            <w:tcW w:type="dxa" w:w="3100"/>
-            <w:tcMar>
-              <w:top w:w="80" w:type="dxa"/>
-              <w:start w:w="120" w:type="dxa"/>
-              <w:bottom w:w="80" w:type="dxa"/>
-              <w:end w:w="120" w:type="dxa"/>
-            </w:tcMar>
-            <w:vAlign w:val="center"/>
-          </w:tcPr>
-          <w:p>
-            <w:pPr>
-              <w:spacing w:after="0"/>
-              <w:jc w:val="left"/>
-            </w:pPr>
-            <w:r>
-              <w:rPr>
-                <w:rFonts w:ascii="Calibri" w:hAnsi="Calibri" w:eastAsia="Microsoft JhengHei"/>
-                <w:b w:val="0"/>
-                <w:color w:val="000000"/>
-                <w:sz w:val="19"/>
-              </w:rPr>
-              <w:t>Run: Running</w:t>
-            </w:r>
-          </w:p>
-        </w:tc>
-        <w:tc>
-          <w:tcPr>
-            <w:tcW w:type="dxa" w:w="1100"/>
-            <w:tcMar>
-              <w:top w:w="80" w:type="dxa"/>
-              <w:start w:w="120" w:type="dxa"/>
-              <w:bottom w:w="80" w:type="dxa"/>
-              <w:end w:w="120" w:type="dxa"/>
-            </w:tcMar>
-            <w:vAlign w:val="center"/>
-          </w:tcPr>
-          <w:p>
-            <w:pPr>
-              <w:spacing w:after="0"/>
-              <w:jc w:val="center"/>
-            </w:pPr>
-            <w:r>
-              <w:rPr>
-                <w:rFonts w:ascii="Calibri" w:hAnsi="Calibri" w:eastAsia="Microsoft JhengHei"/>
-                <w:b w:val="0"/>
-                <w:color w:val="000000"/>
-                <w:sz w:val="19"/>
-              </w:rPr>
-              <w:t>Run</w:t>
-            </w:r>
-          </w:p>
-        </w:tc>
-        <w:tc>
-          <w:tcPr>
-            <w:tcW w:type="dxa" w:w="1600"/>
-            <w:tcMar>
-              <w:top w:w="80" w:type="dxa"/>
-              <w:start w:w="120" w:type="dxa"/>
-              <w:bottom w:w="80" w:type="dxa"/>
-              <w:end w:w="120" w:type="dxa"/>
-            </w:tcMar>
-            <w:vAlign w:val="center"/>
-          </w:tcPr>
-          <w:p>
-            <w:pPr>
-              <w:spacing w:after="0"/>
-              <w:jc w:val="center"/>
-            </w:pPr>
-            <w:r>
-              <w:rPr>
-                <w:rFonts w:ascii="Calibri" w:hAnsi="Calibri" w:eastAsia="Microsoft JhengHei"/>
-                <w:b w:val="0"/>
-                <w:color w:val="000000"/>
-                <w:sz w:val="19"/>
-              </w:rPr>
-              <w:t>90分 / 11.60km</w:t>
-            </w:r>
-          </w:p>
-        </w:tc>
-        <w:tc>
-          <w:tcPr>
-            <w:tcW w:type="dxa" w:w="1600"/>
-            <w:tcMar>
-              <w:top w:w="80" w:type="dxa"/>
-              <w:start w:w="120" w:type="dxa"/>
-              <w:bottom w:w="80" w:type="dxa"/>
-              <w:end w:w="120" w:type="dxa"/>
-            </w:tcMar>
-            <w:vAlign w:val="center"/>
-          </w:tcPr>
-          <w:p>
-            <w:pPr>
-              <w:spacing w:after="0"/>
-              <w:jc w:val="center"/>
-            </w:pPr>
-            <w:r>
-              <w:rPr>
-                <w:rFonts w:ascii="Calibri" w:hAnsi="Calibri" w:eastAsia="Microsoft JhengHei"/>
-                <w:b w:val="0"/>
-                <w:color w:val="000000"/>
-                <w:sz w:val="19"/>
-              </w:rPr>
-              <w:t>86分 / 11.92km</w:t>
-            </w:r>
-          </w:p>
-        </w:tc>
-        <w:tc>
-          <w:tcPr>
-            <w:tcW w:type="dxa" w:w="1160"/>
-            <w:tcMar>
-              <w:top w:w="80" w:type="dxa"/>
-              <w:start w:w="120" w:type="dxa"/>
-              <w:bottom w:w="80" w:type="dxa"/>
-              <w:end w:w="120" w:type="dxa"/>
-            </w:tcMar>
-            <w:vAlign w:val="center"/>
-          </w:tcPr>
-          <w:p>
-            <w:pPr>
-              <w:spacing w:after="0"/>
-              <w:jc w:val="center"/>
-            </w:pPr>
-            <w:r>
-              <w:rPr>
-                <w:rFonts w:ascii="Calibri" w:hAnsi="Calibri" w:eastAsia="Microsoft JhengHei"/>
-                <w:b w:val="0"/>
-                <w:color w:val="000000"/>
-                <w:sz w:val="19"/>
-              </w:rPr>
-              <w:t>✅ 已完成</w:t>
-            </w:r>
-          </w:p>
-        </w:tc>
-      </w:tr>
-      <w:tr>
-        <w:tc>
-          <w:tcPr>
-            <w:tcW w:type="dxa" w:w="1100"/>
-            <w:tcMar>
-              <w:top w:w="80" w:type="dxa"/>
-              <w:start w:w="120" w:type="dxa"/>
-              <w:bottom w:w="80" w:type="dxa"/>
-              <w:end w:w="120" w:type="dxa"/>
-            </w:tcMar>
-            <w:vAlign w:val="center"/>
-          </w:tcPr>
-          <w:p>
-            <w:pPr>
-              <w:spacing w:after="0"/>
-              <w:jc w:val="center"/>
-            </w:pPr>
-            <w:r>
-              <w:rPr>
-                <w:rFonts w:ascii="Calibri" w:hAnsi="Calibri" w:eastAsia="Microsoft JhengHei"/>
-                <w:b w:val="0"/>
-                <w:color w:val="000000"/>
-                <w:sz w:val="19"/>
-              </w:rPr>
-              <w:t>08/12</w:t>
-              <w:br/>
-              <w:t>週三</w:t>
-            </w:r>
-          </w:p>
-        </w:tc>
-        <w:tc>
-          <w:tcPr>
-            <w:tcW w:type="dxa" w:w="3100"/>
-            <w:tcMar>
-              <w:top w:w="80" w:type="dxa"/>
-              <w:start w:w="120" w:type="dxa"/>
-              <w:bottom w:w="80" w:type="dxa"/>
-              <w:end w:w="120" w:type="dxa"/>
-            </w:tcMar>
-            <w:vAlign w:val="center"/>
-          </w:tcPr>
-          <w:p>
-            <w:pPr>
-              <w:spacing w:after="0"/>
-              <w:jc w:val="left"/>
-            </w:pPr>
-            <w:r>
-              <w:rPr>
-                <w:rFonts w:ascii="Calibri" w:hAnsi="Calibri" w:eastAsia="Microsoft JhengHei"/>
-                <w:b w:val="0"/>
-                <w:color w:val="000000"/>
-                <w:sz w:val="19"/>
-              </w:rPr>
-              <w:t>Swim: 甜甜課表</w:t>
-            </w:r>
-          </w:p>
-        </w:tc>
-        <w:tc>
-          <w:tcPr>
-            <w:tcW w:type="dxa" w:w="1100"/>
-            <w:tcMar>
-              <w:top w:w="80" w:type="dxa"/>
-              <w:start w:w="120" w:type="dxa"/>
-              <w:bottom w:w="80" w:type="dxa"/>
-              <w:end w:w="120" w:type="dxa"/>
-            </w:tcMar>
-            <w:vAlign w:val="center"/>
-          </w:tcPr>
-          <w:p>
-            <w:pPr>
-              <w:spacing w:after="0"/>
-              <w:jc w:val="center"/>
-            </w:pPr>
-            <w:r>
-              <w:rPr>
-                <w:rFonts w:ascii="Calibri" w:hAnsi="Calibri" w:eastAsia="Microsoft JhengHei"/>
-                <w:b w:val="0"/>
-                <w:color w:val="000000"/>
-                <w:sz w:val="19"/>
-              </w:rPr>
-              <w:t>Swim</w:t>
-            </w:r>
-          </w:p>
-        </w:tc>
-        <w:tc>
-          <w:tcPr>
-            <w:tcW w:type="dxa" w:w="1600"/>
-            <w:tcMar>
-              <w:top w:w="80" w:type="dxa"/>
-              <w:start w:w="120" w:type="dxa"/>
-              <w:bottom w:w="80" w:type="dxa"/>
-              <w:end w:w="120" w:type="dxa"/>
-            </w:tcMar>
-            <w:vAlign w:val="center"/>
-          </w:tcPr>
-          <w:p>
-            <w:pPr>
-              <w:spacing w:after="0"/>
-              <w:jc w:val="center"/>
-            </w:pPr>
-            <w:r>
-              <w:rPr>
-                <w:rFonts w:ascii="Calibri" w:hAnsi="Calibri" w:eastAsia="Microsoft JhengHei"/>
-                <w:b w:val="0"/>
-                <w:color w:val="000000"/>
-                <w:sz w:val="19"/>
-              </w:rPr>
-              <w:t>80分</w:t>
-            </w:r>
-          </w:p>
-        </w:tc>
-        <w:tc>
-          <w:tcPr>
-            <w:tcW w:type="dxa" w:w="1600"/>
-            <w:tcMar>
-              <w:top w:w="80" w:type="dxa"/>
-              <w:start w:w="120" w:type="dxa"/>
-              <w:bottom w:w="80" w:type="dxa"/>
-              <w:end w:w="120" w:type="dxa"/>
-            </w:tcMar>
-            <w:vAlign w:val="center"/>
-          </w:tcPr>
-          <w:p>
-            <w:pPr>
-              <w:spacing w:after="0"/>
-              <w:jc w:val="center"/>
-            </w:pPr>
-            <w:r>
-              <w:rPr>
-                <w:rFonts w:ascii="Calibri" w:hAnsi="Calibri" w:eastAsia="Microsoft JhengHei"/>
-                <w:b w:val="0"/>
-                <w:color w:val="000000"/>
-                <w:sz w:val="19"/>
-              </w:rPr>
-              <w:t>66分 / 3.30km</w:t>
             </w:r>
           </w:p>
         </w:tc>

</xml_diff>

<commit_message>
Auto Daily 8:00 PM Dashboard Update [2026-08-15 15:53]
</commit_message>
<xml_diff>
--- a/docs/weekly/2026-W33_當週執行率回顧報告.docx
+++ b/docs/weekly/2026-W33_當週執行率回顧報告.docx
@@ -21,7 +21,7 @@
           <w:color w:val="555555"/>
           <w:sz w:val="20"/>
         </w:rPr>
-        <w:t>週期：2026/08/10–2026/08/16　｜　整體時間執行率：38.0%</w:t>
+        <w:t>週期：2026/08/10–2026/08/16　｜　整體時間執行率：77.0%</w:t>
       </w:r>
     </w:p>
     <w:p>
@@ -347,7 +347,7 @@
                 <w:color w:val="000000"/>
                 <w:sz w:val="19"/>
               </w:rPr>
-              <w:t>1.10 hr</w:t>
+              <w:t>2.23 hr</w:t>
             </w:r>
           </w:p>
         </w:tc>
@@ -374,7 +374,7 @@
                 <w:color w:val="000000"/>
                 <w:sz w:val="19"/>
               </w:rPr>
-              <w:t>26.4%</w:t>
+              <w:t>53.6%</w:t>
             </w:r>
           </w:p>
         </w:tc>
@@ -428,7 +428,7 @@
                 <w:color w:val="000000"/>
                 <w:sz w:val="19"/>
               </w:rPr>
-              <w:t>3.30 km</w:t>
+              <w:t>6.60 km</w:t>
             </w:r>
           </w:p>
         </w:tc>
@@ -455,7 +455,7 @@
                 <w:color w:val="000000"/>
                 <w:sz w:val="19"/>
               </w:rPr>
-              <w:t>78.6%</w:t>
+              <w:t>157.1%</w:t>
             </w:r>
           </w:p>
         </w:tc>
@@ -565,7 +565,7 @@
                 <w:color w:val="000000"/>
                 <w:sz w:val="19"/>
               </w:rPr>
-              <w:t>3.23 hr</w:t>
+              <w:t>7.83 hr</w:t>
             </w:r>
           </w:p>
         </w:tc>
@@ -592,7 +592,7 @@
                 <w:color w:val="000000"/>
                 <w:sz w:val="19"/>
               </w:rPr>
-              <w:t>53.9%</w:t>
+              <w:t>130.6%</w:t>
             </w:r>
           </w:p>
         </w:tc>
@@ -646,7 +646,7 @@
                 <w:color w:val="000000"/>
                 <w:sz w:val="19"/>
               </w:rPr>
-              <w:t>60.99 km</w:t>
+              <w:t>188.36 km</w:t>
             </w:r>
           </w:p>
         </w:tc>
@@ -783,7 +783,7 @@
                 <w:color w:val="000000"/>
                 <w:sz w:val="19"/>
               </w:rPr>
-              <w:t>1.75 hr</w:t>
+              <w:t>2.25 hr</w:t>
             </w:r>
           </w:p>
         </w:tc>
@@ -810,7 +810,7 @@
                 <w:color w:val="000000"/>
                 <w:sz w:val="19"/>
               </w:rPr>
-              <w:t>30.0%</w:t>
+              <w:t>38.6%</w:t>
             </w:r>
           </w:p>
         </w:tc>
@@ -864,7 +864,7 @@
                 <w:color w:val="000000"/>
                 <w:sz w:val="19"/>
               </w:rPr>
-              <w:t>15.40 km</w:t>
+              <w:t>19.68 km</w:t>
             </w:r>
           </w:p>
         </w:tc>
@@ -891,7 +891,7 @@
                 <w:color w:val="000000"/>
                 <w:sz w:val="19"/>
               </w:rPr>
-              <w:t>29.8%</w:t>
+              <w:t>38.1%</w:t>
             </w:r>
           </w:p>
         </w:tc>
@@ -2295,7 +2295,7 @@
                 <w:color w:val="000000"/>
                 <w:sz w:val="19"/>
               </w:rPr>
-              <w:t>0分</w:t>
+              <w:t>68分 / 3.30km</w:t>
             </w:r>
           </w:p>
         </w:tc>
@@ -2322,7 +2322,7 @@
                 <w:color w:val="000000"/>
                 <w:sz w:val="19"/>
               </w:rPr>
-              <w:t>❌ 未執行</w:t>
+              <w:t>✅ 已完成</w:t>
             </w:r>
           </w:p>
         </w:tc>
@@ -2461,7 +2461,7 @@
                 <w:color w:val="000000"/>
                 <w:sz w:val="19"/>
               </w:rPr>
-              <w:t>0分</w:t>
+              <w:t>276分 / 127.37km</w:t>
             </w:r>
           </w:p>
         </w:tc>
@@ -2488,7 +2488,7 @@
                 <w:color w:val="000000"/>
                 <w:sz w:val="19"/>
               </w:rPr>
-              <w:t>❌ 未執行</w:t>
+              <w:t>✅ 已完成</w:t>
             </w:r>
           </w:p>
         </w:tc>
@@ -2627,7 +2627,7 @@
                 <w:color w:val="000000"/>
                 <w:sz w:val="19"/>
               </w:rPr>
-              <w:t>0分</w:t>
+              <w:t>30分 / 4.28km</w:t>
             </w:r>
           </w:p>
         </w:tc>
@@ -2654,7 +2654,7 @@
                 <w:color w:val="000000"/>
                 <w:sz w:val="19"/>
               </w:rPr>
-              <w:t>❌ 未執行</w:t>
+              <w:t>✅ 已完成</w:t>
             </w:r>
           </w:p>
         </w:tc>

</xml_diff>

<commit_message>
feat: sync 2026-08-16 run and swim workouts, update W33 execution report and deploy live dashboard
</commit_message>
<xml_diff>
--- a/docs/weekly/2026-W33_當週執行率回顧報告.docx
+++ b/docs/weekly/2026-W33_當週執行率回顧報告.docx
@@ -21,7 +21,7 @@
           <w:color w:val="555555"/>
           <w:sz w:val="20"/>
         </w:rPr>
-        <w:t>週期：2026/08/10–2026/08/16　｜　整體時間執行率：77.0%</w:t>
+        <w:t>週期：2026/08/10–2026/08/16　｜　整體時間執行率：98.8%</w:t>
       </w:r>
     </w:p>
     <w:p>
@@ -347,7 +347,7 @@
                 <w:color w:val="000000"/>
                 <w:sz w:val="19"/>
               </w:rPr>
-              <w:t>2.23 hr</w:t>
+              <w:t>3.65 hr</w:t>
             </w:r>
           </w:p>
         </w:tc>
@@ -374,7 +374,7 @@
                 <w:color w:val="000000"/>
                 <w:sz w:val="19"/>
               </w:rPr>
-              <w:t>53.6%</w:t>
+              <w:t>87.6%</w:t>
             </w:r>
           </w:p>
         </w:tc>
@@ -428,7 +428,7 @@
                 <w:color w:val="000000"/>
                 <w:sz w:val="19"/>
               </w:rPr>
-              <w:t>6.60 km</w:t>
+              <w:t>10.70 km</w:t>
             </w:r>
           </w:p>
         </w:tc>
@@ -455,7 +455,7 @@
                 <w:color w:val="000000"/>
                 <w:sz w:val="19"/>
               </w:rPr>
-              <w:t>157.1%</w:t>
+              <w:t>254.8%</w:t>
             </w:r>
           </w:p>
         </w:tc>
@@ -783,7 +783,7 @@
                 <w:color w:val="000000"/>
                 <w:sz w:val="19"/>
               </w:rPr>
-              <w:t>2.25 hr</w:t>
+              <w:t>4.32 hr</w:t>
             </w:r>
           </w:p>
         </w:tc>
@@ -810,7 +810,7 @@
                 <w:color w:val="000000"/>
                 <w:sz w:val="19"/>
               </w:rPr>
-              <w:t>38.6%</w:t>
+              <w:t>74.0%</w:t>
             </w:r>
           </w:p>
         </w:tc>
@@ -864,7 +864,7 @@
                 <w:color w:val="000000"/>
                 <w:sz w:val="19"/>
               </w:rPr>
-              <w:t>19.68 km</w:t>
+              <w:t>37.20 km</w:t>
             </w:r>
           </w:p>
         </w:tc>
@@ -891,7 +891,7 @@
                 <w:color w:val="000000"/>
                 <w:sz w:val="19"/>
               </w:rPr>
-              <w:t>38.1%</w:t>
+              <w:t>72.1%</w:t>
             </w:r>
           </w:p>
         </w:tc>
@@ -2793,7 +2793,7 @@
                 <w:color w:val="000000"/>
                 <w:sz w:val="19"/>
               </w:rPr>
-              <w:t>0分</w:t>
+              <w:t>124分 / 17.52km</w:t>
             </w:r>
           </w:p>
         </w:tc>
@@ -2820,7 +2820,7 @@
                 <w:color w:val="000000"/>
                 <w:sz w:val="19"/>
               </w:rPr>
-              <w:t>❌ 未執行</w:t>
+              <w:t>✅ 已完成</w:t>
             </w:r>
           </w:p>
         </w:tc>
@@ -2959,7 +2959,7 @@
                 <w:color w:val="000000"/>
                 <w:sz w:val="19"/>
               </w:rPr>
-              <w:t>0分</w:t>
+              <w:t>85分 / 4.10km</w:t>
             </w:r>
           </w:p>
         </w:tc>
@@ -2986,7 +2986,7 @@
                 <w:color w:val="000000"/>
                 <w:sz w:val="19"/>
               </w:rPr>
-              <w:t>❌ 未執行</w:t>
+              <w:t>✅ 已完成</w:t>
             </w:r>
           </w:p>
         </w:tc>
@@ -3013,11 +3013,19 @@
     </w:p>
     <w:p>
       <w:r>
-        <w:t>• 當週累積自行車 188.36 km、跑步 19.68 km、游泳 6.60 km，整體時間執行率達 77.0%。</w:t>
+        <w:t>• 當週累積自行車 188.36 km、跑步 37.20 km、游泳 10.70 km，整體時間執行率達 98.8%。</w:t>
         <w:br/>
       </w:r>
       <w:r>
         <w:t>• 長距離單車扎實完成，左右踩踏發力極為平衡 (50.5% / 49.5%)，座艙穩定度高。</w:t>
+        <w:br/>
+      </w:r>
+      <w:r>
+        <w:t>• 8/16 順利完成 17.52 km 長跑（總爬升 +327m），平路河濱漸速至 5:26/km，上坡穩健控心率並自覺補水折返，下坡迅速拉高步頻收尾。</w:t>
+        <w:br/>
+      </w:r>
+      <w:r>
+        <w:t>• 8/16 游泳實游 4,100m，雙組 1,600m 自由式持續游繳出 1:56~1:58/100m 高度一致均速與 140 bpm 穩定心率，水感極佳。</w:t>
         <w:br/>
       </w:r>
       <w:r>
@@ -3049,6 +3057,10 @@
         <w:t>• 跑步維持 175–180 spm 步頻與短觸地時間，保護關節與下半程剛性。</w:t>
         <w:br/>
       </w:r>
+      <w:r>
+        <w:t>• 游泳巡航手感定型：維持放鬆 Zone 1-2 低心率划水，出水前保持平穩定位，直指 Sub-11 1:12:00 (1:53/100m) 配速線。</w:t>
+        <w:br/>
+      </w:r>
     </w:p>
     <w:p>
       <w:r>
@@ -3071,7 +3083,7 @@
         <w:br/>
       </w:r>
       <w:r>
-        <w:t>• 單日累積 TSS 超過 300 時，次日請以完全休息或低心率排酸為主。</w:t>
+        <w:t>• 週末連續雙大日累積負荷高，週一請務必以完全休息 (Rest Day) 或低心率排酸輕鬆游/滾筒伸展為主。</w:t>
         <w:br/>
       </w:r>
     </w:p>

</xml_diff>